<commit_message>
Docs: environment setup and source code guides; architecture, users and roadmap guides updated for the test site; HTML sources in docs/source
Co-Authored-By: Claude Opus 5.5 <noreply@anthropic.com>
Claude-Session: https://claude.ai/code/session_01KXW9v8jDiwJH8ygRWfLvFB
</commit_message>
<xml_diff>
--- a/docs/LKA-Invoices-Future-Enhancements.docx
+++ b/docs/LKA-Invoices-Future-Enhancements.docx
@@ -32,7 +32,7 @@
           <w:b w:val="0"/>
           <w:i w:val="0"/>
         </w:rPr>
-        <w:t xml:space="preserve"> Lingeshwar Kaparthi &amp; Associates · Live app: lingeshwarca-invoice.netlify.app · Prepared 2 October 2026</w:t>
+        <w:t xml:space="preserve"> Lingeshwar Kaparthi &amp; Associates · Live app: lingeshwarca-invoice.netlify.app · Updated October 2026</w:t>
       </w:r>
     </w:p>
     <w:p>
@@ -2341,6 +2341,68 @@
                 <w:sz w:val="18"/>
               </w:rPr>
               <w:t>Only requests from the real website (verified by free reCAPTCHA) can reach the database.</w:t>
+            </w:r>
+          </w:p>
+        </w:tc>
+        <w:tc>
+          <w:tcPr>
+            <w:tcW w:type="dxa" w:w="1134"/>
+          </w:tcPr>
+          <w:p>
+            <w:r>
+              <w:rPr>
+                <w:b w:val="0"/>
+                <w:i w:val="0"/>
+                <w:sz w:val="18"/>
+              </w:rPr>
+              <w:t>Next</w:t>
+            </w:r>
+          </w:p>
+        </w:tc>
+        <w:tc>
+          <w:tcPr>
+            <w:tcW w:type="dxa" w:w="1134"/>
+          </w:tcPr>
+          <w:p>
+            <w:r>
+              <w:rPr>
+                <w:b w:val="0"/>
+                <w:i w:val="0"/>
+                <w:sz w:val="18"/>
+              </w:rPr>
+              <w:t>S</w:t>
+            </w:r>
+          </w:p>
+        </w:tc>
+      </w:tr>
+      <w:tr>
+        <w:tc>
+          <w:tcPr>
+            <w:tcW w:type="dxa" w:w="1134"/>
+          </w:tcPr>
+          <w:p>
+            <w:r>
+              <w:rPr>
+                <w:b/>
+                <w:i w:val="0"/>
+                <w:sz w:val="18"/>
+              </w:rPr>
+              <w:t>Sample-data double lock</w:t>
+            </w:r>
+          </w:p>
+        </w:tc>
+        <w:tc>
+          <w:tcPr>
+            <w:tcW w:type="dxa" w:w="1134"/>
+          </w:tcPr>
+          <w:p>
+            <w:r>
+              <w:rPr>
+                <w:b w:val="0"/>
+                <w:i w:val="0"/>
+                <w:sz w:val="18"/>
+              </w:rPr>
+              <w:t>The test-site "Load sample data" button also checks that the connected Firebase project id contains "staging"/"test", so a wrong Netlify setting can never add sample data to the live project.</w:t>
             </w:r>
           </w:p>
         </w:tc>
@@ -4901,7 +4963,7 @@
           <w:b w:val="0"/>
           <w:i w:val="0"/>
         </w:rPr>
-        <w:t>Payment reminders · receipts · client statements · Reports page · client tags, notes and CSV import · PAID/DRAFT watermarks and clickable UPI link · Home "Today" panel, charts, goal ring, weekly summary, activity feed, nudges, milestones · search palette (Ctrl+K) and shortcuts · notification bell · editable message templates · activity log · duplicate invoice · due-date presets · skeleton loaders, empty states, status colours, overdue badges, confetti · floating "+" on phones · inline help tips · three access levels (owner, admin without revenue, staff).</w:t>
+        <w:t>Payment reminders · receipts · client statements · Reports page · client tags, notes and CSV import · PAID/DRAFT watermarks and clickable UPI link · Home "Today" panel, charts, goal ring, weekly summary, activity feed, nudges, milestones · search palette (Ctrl+K) and shortcuts · notification bell · editable message templates · activity log · duplicate invoice · due-date presets · skeleton loaders, empty states, status colours, overdue badges, confetti · floating "+" on phones · inline help tips · three access levels (owner, admin without revenue, staff) · only owners add, change or remove users · access level chosen when adding a user · PAID stamp on invoice PDFs · back links on invoice and client pages · invoice-number search in Clients · Newest / Oldest invoice sort · test site (staging branch, separate test Firebase project, "TEST SITE" banner, Load sample data button).</w:t>
       </w:r>
     </w:p>
     <w:sectPr>

</xml_diff>